<commit_message>
Update todo doc and local settings; ignore Word temp files
Co-Authored-By: Claude Opus 4.8 <noreply@anthropic.com>
</commit_message>
<xml_diff>
--- a/Document/todo.docx
+++ b/Document/todo.docx
@@ -77,6 +77,127 @@
           <w:numId w:val="1"/>
         </w:numPr>
       </w:pPr>
+      <w:r>
+        <w:t xml:space="preserve">Una sessione prenotata </w:t>
+      </w:r>
+      <w:proofErr w:type="spellStart"/>
+      <w:r>
+        <w:t>puo</w:t>
+      </w:r>
+      <w:proofErr w:type="spellEnd"/>
+      <w:r>
+        <w:t xml:space="preserve"> essere cancellata dall’atleta o da coach se si entro quanto prima?</w:t>
+      </w:r>
+    </w:p>
+    <w:p>
+      <w:pPr>
+        <w:pStyle w:val="Paragrafoelenco"/>
+        <w:numPr>
+          <w:ilvl w:val="0"/>
+          <w:numId w:val="1"/>
+        </w:numPr>
+      </w:pPr>
+      <w:r>
+        <w:t xml:space="preserve">Nela calendario il colore degli appuntamenti rosso non è corretto.. deve essere grigio se nel passato ed è stato fatto, barrato se è stato rifiutato verde da fare e </w:t>
+      </w:r>
+      <w:proofErr w:type="spellStart"/>
+      <w:r>
+        <w:t>acccettata</w:t>
+      </w:r>
+      <w:proofErr w:type="spellEnd"/>
+      <w:r>
+        <w:t xml:space="preserve"> blu da fare non ancora accettato.</w:t>
+      </w:r>
+    </w:p>
+    <w:p>
+      <w:pPr>
+        <w:pStyle w:val="Paragrafoelenco"/>
+        <w:numPr>
+          <w:ilvl w:val="0"/>
+          <w:numId w:val="1"/>
+        </w:numPr>
+      </w:pPr>
+      <w:r>
+        <w:t>Le sessioni completate voglio vedere il tempo totale della sessione..</w:t>
+      </w:r>
+    </w:p>
+    <w:p>
+      <w:pPr>
+        <w:pStyle w:val="Paragrafoelenco"/>
+        <w:numPr>
+          <w:ilvl w:val="0"/>
+          <w:numId w:val="1"/>
+        </w:numPr>
+      </w:pPr>
+      <w:r>
+        <w:t>Quando vado sopra al nome nel tag deve diventare blu</w:t>
+      </w:r>
+    </w:p>
+    <w:p>
+      <w:pPr>
+        <w:pStyle w:val="Paragrafoelenco"/>
+        <w:numPr>
+          <w:ilvl w:val="0"/>
+          <w:numId w:val="1"/>
+        </w:numPr>
+      </w:pPr>
+      <w:r>
+        <w:t xml:space="preserve">Togliere la scritta dashboard </w:t>
+      </w:r>
+      <w:proofErr w:type="spellStart"/>
+      <w:r>
+        <w:t>alteta</w:t>
+      </w:r>
+      <w:proofErr w:type="spellEnd"/>
+      <w:r>
+        <w:t xml:space="preserve"> e dashboard coach.</w:t>
+      </w:r>
+    </w:p>
+    <w:p/>
+    <w:p/>
+    <w:p>
+      <w:r>
+        <w:t>Quando clicco su nuovo appuntamento deve di default presentarmi l’ultimo coach con il quale ho fatto un appuntamento</w:t>
+      </w:r>
+    </w:p>
+    <w:p>
+      <w:r>
+        <w:t xml:space="preserve">La data non </w:t>
+      </w:r>
+      <w:proofErr w:type="spellStart"/>
+      <w:r>
+        <w:t>puo</w:t>
+      </w:r>
+      <w:proofErr w:type="spellEnd"/>
+      <w:r>
+        <w:t xml:space="preserve"> essere messa nel passato e default mette oggi/ora</w:t>
+      </w:r>
+    </w:p>
+    <w:p>
+      <w:r>
+        <w:t xml:space="preserve">Il </w:t>
+      </w:r>
+      <w:proofErr w:type="spellStart"/>
+      <w:r>
+        <w:t>button</w:t>
+      </w:r>
+      <w:proofErr w:type="spellEnd"/>
+      <w:r>
+        <w:t xml:space="preserve"> nuovo appuntamento potrebbe servire anche nel tab calendario-</w:t>
+      </w:r>
+    </w:p>
+    <w:p>
+      <w:r>
+        <w:t xml:space="preserve">Una sessione prenotata </w:t>
+      </w:r>
+      <w:proofErr w:type="spellStart"/>
+      <w:r>
+        <w:t>puo</w:t>
+      </w:r>
+      <w:proofErr w:type="spellEnd"/>
+      <w:r>
+        <w:t xml:space="preserve"> essere cancellata dall’atleta o da coach se si entro quanto prima?</w:t>
+      </w:r>
     </w:p>
     <w:sectPr>
       <w:pgSz w:w="11906" w:h="16838"/>

</xml_diff>

<commit_message>
feat: add AI session report MVP
</commit_message>
<xml_diff>
--- a/Document/todo.docx
+++ b/Document/todo.docx
@@ -29,7 +29,13 @@
         </w:numPr>
       </w:pPr>
       <w:r>
-        <w:t>Pacchetti come funzionano aggiungere discout anual.</w:t>
+        <w:t>Pacchetti come funzionano aggiungere disc</w:t>
+      </w:r>
+      <w:r>
+        <w:t>c</w:t>
+      </w:r>
+      <w:r>
+        <w:t>out anual.</w:t>
       </w:r>
     </w:p>
     <w:p>
@@ -51,8 +57,14 @@
           <w:ilvl w:val="0"/>
           <w:numId w:val="1"/>
         </w:numPr>
-      </w:pPr>
-      <w:r>
+        <w:rPr>
+          <w:strike/>
+        </w:rPr>
+      </w:pPr>
+      <w:r>
+        <w:rPr>
+          <w:strike/>
+        </w:rPr>
         <w:t>Nela calendario il colore degli appuntamenti rosso non è corretto.. deve essere grigio se nel passato ed è stato fatto, barrato se è stato rifiutato verde da fare e acccettata blu da fare non ancora accettato.</w:t>
       </w:r>
     </w:p>
@@ -63,8 +75,14 @@
           <w:ilvl w:val="0"/>
           <w:numId w:val="1"/>
         </w:numPr>
-      </w:pPr>
-      <w:r>
+        <w:rPr>
+          <w:strike/>
+        </w:rPr>
+      </w:pPr>
+      <w:r>
+        <w:rPr>
+          <w:strike/>
+        </w:rPr>
         <w:t>Le sessioni completate voglio vedere il tempo totale della sessione..</w:t>
       </w:r>
     </w:p>
@@ -75,8 +93,14 @@
           <w:ilvl w:val="0"/>
           <w:numId w:val="1"/>
         </w:numPr>
-      </w:pPr>
-      <w:r>
+        <w:rPr>
+          <w:strike/>
+        </w:rPr>
+      </w:pPr>
+      <w:r>
+        <w:rPr>
+          <w:strike/>
+        </w:rPr>
         <w:t>Quando vado sopra al nome nel tag deve diventare blu</w:t>
       </w:r>
     </w:p>
@@ -148,6 +172,21 @@
           <w:numId w:val="1"/>
         </w:numPr>
       </w:pPr>
+      <w:r>
+        <w:t>Compagna referal invita un amico.</w:t>
+      </w:r>
+    </w:p>
+    <w:p>
+      <w:pPr>
+        <w:pStyle w:val="Paragrafoelenco"/>
+        <w:numPr>
+          <w:ilvl w:val="0"/>
+          <w:numId w:val="1"/>
+        </w:numPr>
+      </w:pPr>
+      <w:r>
+        <w:t xml:space="preserve"> landing page un CTA ‘registrati gratis’ o anche un ‘invita un amico’ che apre wahapp</w:t>
+      </w:r>
     </w:p>
     <w:p>
       <w:pPr>
@@ -291,11 +330,13 @@
           <w:numId w:val="1"/>
         </w:numPr>
         <w:rPr>
-          <w:color w:val="EE0000"/>
-        </w:rPr>
-      </w:pPr>
-      <w:r>
-        <w:rPr>
+          <w:strike/>
+          <w:color w:val="EE0000"/>
+        </w:rPr>
+      </w:pPr>
+      <w:r>
+        <w:rPr>
+          <w:strike/>
           <w:color w:val="EE0000"/>
         </w:rPr>
         <w:t>Se ricevo un mess da app moble mi appare il mess? O anche di un nuovo mess da dentro l’app</w:t>
@@ -318,6 +359,141 @@
         </w:rPr>
         <w:t>Se le notifiche sono attive o no dovrà essere una configurazione a db dovrà esserci tabella per la userconfig.</w:t>
       </w:r>
+    </w:p>
+    <w:p>
+      <w:pPr>
+        <w:pStyle w:val="Paragrafoelenco"/>
+        <w:numPr>
+          <w:ilvl w:val="0"/>
+          <w:numId w:val="1"/>
+        </w:numPr>
+        <w:rPr>
+          <w:color w:val="EE0000"/>
+        </w:rPr>
+      </w:pPr>
+      <w:r>
+        <w:rPr>
+          <w:color w:val="EE0000"/>
+        </w:rPr>
+        <w:t>Se clicco nuovo appuntamento come coach dche atleti devo vedere, e se faccio la stessa cosa come atleta che devo vedere?</w:t>
+      </w:r>
+    </w:p>
+    <w:p>
+      <w:pPr>
+        <w:pStyle w:val="Paragrafoelenco"/>
+        <w:numPr>
+          <w:ilvl w:val="0"/>
+          <w:numId w:val="1"/>
+        </w:numPr>
+        <w:rPr>
+          <w:color w:val="EE0000"/>
+        </w:rPr>
+      </w:pPr>
+      <w:r>
+        <w:rPr>
+          <w:color w:val="EE0000"/>
+        </w:rPr>
+        <w:t>Minore registrazione, dice che servirà autorizzazione del genitore ma anche se non c’è fa creare ee pianificare appuntamenti e non va bene … l’approvazione del genitore sono campi testo libero e non va bene va acqua da tutte le parti, ma gli altri che fanno?</w:t>
+      </w:r>
+    </w:p>
+    <w:p>
+      <w:pPr>
+        <w:pStyle w:val="Paragrafoelenco"/>
+        <w:numPr>
+          <w:ilvl w:val="0"/>
+          <w:numId w:val="1"/>
+        </w:numPr>
+        <w:rPr>
+          <w:color w:val="EE0000"/>
+        </w:rPr>
+      </w:pPr>
+      <w:r>
+        <w:rPr>
+          <w:color w:val="EE0000"/>
+        </w:rPr>
+        <w:t>Se mi registro e modifico la data di nascita e mi metto minorenne il sistema dovrebbe bloccarmi non salvare modifiche della data se la nuova data diventa minorenne.</w:t>
+      </w:r>
+    </w:p>
+    <w:p>
+      <w:pPr>
+        <w:pStyle w:val="Paragrafoelenco"/>
+        <w:numPr>
+          <w:ilvl w:val="0"/>
+          <w:numId w:val="1"/>
+        </w:numPr>
+        <w:rPr>
+          <w:color w:val="EE0000"/>
+        </w:rPr>
+      </w:pPr>
+      <w:r>
+        <w:rPr>
+          <w:color w:val="EE0000"/>
+        </w:rPr>
+        <w:t>Impatti nome dominio su link interni su referal su invita un amico..</w:t>
+      </w:r>
+    </w:p>
+    <w:p>
+      <w:pPr>
+        <w:rPr>
+          <w:b/>
+          <w:bCs/>
+        </w:rPr>
+      </w:pPr>
+      <w:r>
+        <w:rPr>
+          <w:b/>
+          <w:bCs/>
+        </w:rPr>
+        <w:t>Domande.</w:t>
+      </w:r>
+    </w:p>
+    <w:p>
+      <w:pPr>
+        <w:pStyle w:val="Paragrafoelenco"/>
+        <w:numPr>
+          <w:ilvl w:val="0"/>
+          <w:numId w:val="2"/>
+        </w:numPr>
+        <w:rPr>
+          <w:b/>
+          <w:bCs/>
+        </w:rPr>
+      </w:pPr>
+      <w:r>
+        <w:rPr>
+          <w:b/>
+          <w:bCs/>
+        </w:rPr>
+        <w:t>Esiste un accoun gmail di kaipai?</w:t>
+      </w:r>
+    </w:p>
+    <w:p>
+      <w:pPr>
+        <w:pStyle w:val="Paragrafoelenco"/>
+        <w:numPr>
+          <w:ilvl w:val="0"/>
+          <w:numId w:val="2"/>
+        </w:numPr>
+        <w:rPr>
+          <w:b/>
+          <w:bCs/>
+        </w:rPr>
+      </w:pPr>
+      <w:r>
+        <w:rPr>
+          <w:b/>
+          <w:bCs/>
+        </w:rPr>
+        <w:t>Dominio? Lo creiamo e compriamo?</w:t>
+      </w:r>
+    </w:p>
+    <w:p>
+      <w:pPr>
+        <w:rPr>
+          <w:b/>
+          <w:bCs/>
+        </w:rPr>
+      </w:pPr>
     </w:p>
     <w:p>
       <w:pPr>
@@ -507,8 +683,97 @@
       </w:rPr>
     </w:lvl>
   </w:abstractNum>
+  <w:abstractNum w:abstractNumId="1" w15:restartNumberingAfterBreak="0">
+    <w:nsid w:val="7C7E51FA"/>
+    <w:multiLevelType w:val="hybridMultilevel"/>
+    <w:tmpl w:val="3BE6430E"/>
+    <w:lvl w:ilvl="0" w:tplc="0410000F">
+      <w:start w:val="1"/>
+      <w:numFmt w:val="decimal"/>
+      <w:lvlText w:val="%1."/>
+      <w:lvlJc w:val="left"/>
+      <w:pPr>
+        <w:ind w:left="720" w:hanging="360"/>
+      </w:pPr>
+    </w:lvl>
+    <w:lvl w:ilvl="1" w:tplc="04100019" w:tentative="1">
+      <w:start w:val="1"/>
+      <w:numFmt w:val="lowerLetter"/>
+      <w:lvlText w:val="%2."/>
+      <w:lvlJc w:val="left"/>
+      <w:pPr>
+        <w:ind w:left="1440" w:hanging="360"/>
+      </w:pPr>
+    </w:lvl>
+    <w:lvl w:ilvl="2" w:tplc="0410001B" w:tentative="1">
+      <w:start w:val="1"/>
+      <w:numFmt w:val="lowerRoman"/>
+      <w:lvlText w:val="%3."/>
+      <w:lvlJc w:val="right"/>
+      <w:pPr>
+        <w:ind w:left="2160" w:hanging="180"/>
+      </w:pPr>
+    </w:lvl>
+    <w:lvl w:ilvl="3" w:tplc="0410000F" w:tentative="1">
+      <w:start w:val="1"/>
+      <w:numFmt w:val="decimal"/>
+      <w:lvlText w:val="%4."/>
+      <w:lvlJc w:val="left"/>
+      <w:pPr>
+        <w:ind w:left="2880" w:hanging="360"/>
+      </w:pPr>
+    </w:lvl>
+    <w:lvl w:ilvl="4" w:tplc="04100019" w:tentative="1">
+      <w:start w:val="1"/>
+      <w:numFmt w:val="lowerLetter"/>
+      <w:lvlText w:val="%5."/>
+      <w:lvlJc w:val="left"/>
+      <w:pPr>
+        <w:ind w:left="3600" w:hanging="360"/>
+      </w:pPr>
+    </w:lvl>
+    <w:lvl w:ilvl="5" w:tplc="0410001B" w:tentative="1">
+      <w:start w:val="1"/>
+      <w:numFmt w:val="lowerRoman"/>
+      <w:lvlText w:val="%6."/>
+      <w:lvlJc w:val="right"/>
+      <w:pPr>
+        <w:ind w:left="4320" w:hanging="180"/>
+      </w:pPr>
+    </w:lvl>
+    <w:lvl w:ilvl="6" w:tplc="0410000F" w:tentative="1">
+      <w:start w:val="1"/>
+      <w:numFmt w:val="decimal"/>
+      <w:lvlText w:val="%7."/>
+      <w:lvlJc w:val="left"/>
+      <w:pPr>
+        <w:ind w:left="5040" w:hanging="360"/>
+      </w:pPr>
+    </w:lvl>
+    <w:lvl w:ilvl="7" w:tplc="04100019" w:tentative="1">
+      <w:start w:val="1"/>
+      <w:numFmt w:val="lowerLetter"/>
+      <w:lvlText w:val="%8."/>
+      <w:lvlJc w:val="left"/>
+      <w:pPr>
+        <w:ind w:left="5760" w:hanging="360"/>
+      </w:pPr>
+    </w:lvl>
+    <w:lvl w:ilvl="8" w:tplc="0410001B" w:tentative="1">
+      <w:start w:val="1"/>
+      <w:numFmt w:val="lowerRoman"/>
+      <w:lvlText w:val="%9."/>
+      <w:lvlJc w:val="right"/>
+      <w:pPr>
+        <w:ind w:left="6480" w:hanging="180"/>
+      </w:pPr>
+    </w:lvl>
+  </w:abstractNum>
   <w:num w:numId="1" w16cid:durableId="673655515">
     <w:abstractNumId w:val="0"/>
+  </w:num>
+  <w:num w:numId="2" w16cid:durableId="475955174">
+    <w:abstractNumId w:val="1"/>
   </w:num>
 </w:numbering>
 </file>

</xml_diff>

<commit_message>
feat: completa esperienza demo e rifiniture prodotto
</commit_message>
<xml_diff>
--- a/Document/todo.docx
+++ b/Document/todo.docx
@@ -9,6 +9,11 @@
     </w:p>
     <w:p/>
     <w:p>
+      <w:r>
+        <w:t>Legal</w:t>
+      </w:r>
+    </w:p>
+    <w:p>
       <w:pPr>
         <w:pStyle w:val="Paragrafoelenco"/>
         <w:numPr>
@@ -30,15 +35,147 @@
       </w:r>
       <w:proofErr w:type="spellEnd"/>
       <w:r>
-        <w:t xml:space="preserve">, contratto per coach, </w:t>
-      </w:r>
+        <w:t xml:space="preserve">, </w:t>
+      </w:r>
+    </w:p>
+    <w:p>
+      <w:pPr>
+        <w:pStyle w:val="Paragrafoelenco"/>
+        <w:numPr>
+          <w:ilvl w:val="0"/>
+          <w:numId w:val="1"/>
+        </w:numPr>
+      </w:pPr>
+      <w:r>
+        <w:t xml:space="preserve">contratto per coach, </w:t>
+      </w:r>
+    </w:p>
+    <w:p>
+      <w:pPr>
+        <w:pStyle w:val="Paragrafoelenco"/>
+        <w:numPr>
+          <w:ilvl w:val="0"/>
+          <w:numId w:val="1"/>
+        </w:numPr>
+      </w:pPr>
       <w:proofErr w:type="spellStart"/>
       <w:r>
         <w:t>discalimer</w:t>
       </w:r>
       <w:proofErr w:type="spellEnd"/>
       <w:r>
-        <w:t xml:space="preserve"> per video/trascrizioni, per i minori come funziona?</w:t>
+        <w:t xml:space="preserve"> per video/trascrizioni, </w:t>
+      </w:r>
+    </w:p>
+    <w:p>
+      <w:pPr>
+        <w:pStyle w:val="Paragrafoelenco"/>
+        <w:numPr>
+          <w:ilvl w:val="0"/>
+          <w:numId w:val="1"/>
+        </w:numPr>
+      </w:pPr>
+      <w:proofErr w:type="spellStart"/>
+      <w:r>
+        <w:t>Regitrazione</w:t>
+      </w:r>
+      <w:proofErr w:type="spellEnd"/>
+      <w:r>
+        <w:t xml:space="preserve"> per minori </w:t>
+      </w:r>
+      <w:r>
+        <w:t>come funziona?</w:t>
+      </w:r>
+    </w:p>
+    <w:p>
+      <w:pPr>
+        <w:pStyle w:val="Paragrafoelenco"/>
+        <w:numPr>
+          <w:ilvl w:val="0"/>
+          <w:numId w:val="1"/>
+        </w:numPr>
+      </w:pPr>
+      <w:r>
+        <w:t>Liberatoria manleva di registrazione call sia video che audio per scopi accademici che per scopi antifrode per valutare se le persone si mettono d’accordo per uscire dalla piattaforma…</w:t>
+      </w:r>
+    </w:p>
+    <w:p>
+      <w:pPr>
+        <w:pStyle w:val="Paragrafoelenco"/>
+        <w:numPr>
+          <w:ilvl w:val="0"/>
+          <w:numId w:val="1"/>
+        </w:numPr>
+      </w:pPr>
+      <w:r>
+        <w:t xml:space="preserve">La parte </w:t>
+      </w:r>
+      <w:proofErr w:type="spellStart"/>
+      <w:r>
+        <w:t>legal</w:t>
+      </w:r>
+      <w:proofErr w:type="spellEnd"/>
+      <w:r>
+        <w:t xml:space="preserve"> da fare c’è la lista della spesa e fare doc da far validare a Avvocato.</w:t>
+      </w:r>
+    </w:p>
+    <w:p>
+      <w:pPr>
+        <w:pStyle w:val="Paragrafoelenco"/>
+        <w:numPr>
+          <w:ilvl w:val="0"/>
+          <w:numId w:val="1"/>
+        </w:numPr>
+      </w:pPr>
+      <w:r>
+        <w:t xml:space="preserve">Minore registrazione, dice che servirà autorizzazione del genitore ma anche se non c’è fa creare </w:t>
+      </w:r>
+      <w:proofErr w:type="spellStart"/>
+      <w:r>
+        <w:t>ee</w:t>
+      </w:r>
+      <w:proofErr w:type="spellEnd"/>
+      <w:r>
+        <w:t xml:space="preserve"> pianificare appuntamenti e non va bene … l’approvazione del genitore sono campi testo libero e non va bene va acqua da tutte le parti, ma gli altri che fanno?</w:t>
+      </w:r>
+    </w:p>
+    <w:p>
+      <w:pPr>
+        <w:pStyle w:val="Paragrafoelenco"/>
+        <w:numPr>
+          <w:ilvl w:val="0"/>
+          <w:numId w:val="1"/>
+        </w:numPr>
+      </w:pPr>
+      <w:r>
+        <w:t>Se mi registro e modifico la data di nascita e mi metto minorenne il sistema dovrebbe bloccarmi non salvare modifiche della data se la nuova data diventa minorenne.</w:t>
+      </w:r>
+    </w:p>
+    <w:p>
+      <w:pPr>
+        <w:pStyle w:val="Paragrafoelenco"/>
+        <w:numPr>
+          <w:ilvl w:val="0"/>
+          <w:numId w:val="1"/>
+        </w:numPr>
+      </w:pPr>
+      <w:r>
+        <w:t>Test minorenne</w:t>
+      </w:r>
+    </w:p>
+    <w:p>
+      <w:pPr>
+        <w:pStyle w:val="Paragrafoelenco"/>
+        <w:numPr>
+          <w:ilvl w:val="0"/>
+          <w:numId w:val="1"/>
+        </w:numPr>
+      </w:pPr>
+    </w:p>
+    <w:p/>
+    <w:p>
+      <w:r>
+        <w:t>Abbonamenti</w:t>
       </w:r>
     </w:p>
     <w:p>
@@ -75,6 +212,12 @@
         <w:t>.</w:t>
       </w:r>
     </w:p>
+    <w:p/>
+    <w:p>
+      <w:r>
+        <w:t>Altro</w:t>
+      </w:r>
+    </w:p>
     <w:p>
       <w:pPr>
         <w:pStyle w:val="Paragrafoelenco"/>
@@ -189,18 +332,6 @@
         </w:numPr>
       </w:pPr>
       <w:r>
-        <w:t>Quando seleziono ora i minuti che vadano di 5 in 5</w:t>
-      </w:r>
-    </w:p>
-    <w:p>
-      <w:pPr>
-        <w:pStyle w:val="Paragrafoelenco"/>
-        <w:numPr>
-          <w:ilvl w:val="0"/>
-          <w:numId w:val="1"/>
-        </w:numPr>
-      </w:pPr>
-      <w:r>
         <w:t xml:space="preserve">Una sessione prenotata </w:t>
       </w:r>
       <w:proofErr w:type="spellStart"/>
@@ -219,8 +350,14 @@
           <w:ilvl w:val="0"/>
           <w:numId w:val="1"/>
         </w:numPr>
-      </w:pPr>
-      <w:r>
+        <w:rPr>
+          <w:strike/>
+        </w:rPr>
+      </w:pPr>
+      <w:r>
+        <w:rPr>
+          <w:strike/>
+        </w:rPr>
         <w:t>Gestione notifiche</w:t>
       </w:r>
     </w:p>
@@ -232,23 +369,216 @@
           <w:numId w:val="1"/>
         </w:numPr>
       </w:pPr>
-      <w:r>
+      <w:proofErr w:type="spellStart"/>
+      <w:r>
+        <w:t>reCAPTCHA</w:t>
+      </w:r>
+      <w:proofErr w:type="spellEnd"/>
+      <w:r>
+        <w:t xml:space="preserve"> form contatti.</w:t>
+      </w:r>
+    </w:p>
+    <w:p>
+      <w:pPr>
+        <w:pStyle w:val="Paragrafoelenco"/>
+        <w:numPr>
+          <w:ilvl w:val="0"/>
+          <w:numId w:val="1"/>
+        </w:numPr>
+      </w:pPr>
+      <w:r>
+        <w:t>Utenti demo e dati demo (</w:t>
+      </w:r>
+      <w:proofErr w:type="spellStart"/>
+      <w:r>
+        <w:t>reandonly</w:t>
+      </w:r>
+      <w:proofErr w:type="spellEnd"/>
+      <w:r>
+        <w:t>)</w:t>
+      </w:r>
+    </w:p>
+    <w:p>
+      <w:pPr>
+        <w:pStyle w:val="Paragrafoelenco"/>
+        <w:numPr>
+          <w:ilvl w:val="0"/>
+          <w:numId w:val="1"/>
+        </w:numPr>
+      </w:pPr>
+      <w:r>
+        <w:t>Nuovo coach prevede si l’</w:t>
+      </w:r>
+      <w:proofErr w:type="spellStart"/>
+      <w:r>
+        <w:t>appovazione</w:t>
+      </w:r>
+      <w:proofErr w:type="spellEnd"/>
+      <w:r>
+        <w:t xml:space="preserve"> ma anche un colloquio conoscitivo (facoltativo). Tra il nuovo coach e l’admin.</w:t>
+      </w:r>
+    </w:p>
+    <w:p>
+      <w:pPr>
+        <w:pStyle w:val="Paragrafoelenco"/>
+        <w:numPr>
+          <w:ilvl w:val="0"/>
+          <w:numId w:val="1"/>
+        </w:numPr>
+      </w:pPr>
+      <w:r>
+        <w:t>Podcast da valutare come sezione del sito..</w:t>
+      </w:r>
+    </w:p>
+    <w:p>
+      <w:pPr>
+        <w:pStyle w:val="Paragrafoelenco"/>
+        <w:numPr>
+          <w:ilvl w:val="0"/>
+          <w:numId w:val="1"/>
+        </w:numPr>
+      </w:pPr>
+      <w:r>
+        <w:t xml:space="preserve">Se le notifiche sono attive o no dovrà essere una configurazione a </w:t>
+      </w:r>
+      <w:proofErr w:type="spellStart"/>
+      <w:r>
+        <w:t>db</w:t>
+      </w:r>
+      <w:proofErr w:type="spellEnd"/>
+      <w:r>
+        <w:t xml:space="preserve"> dovrà esserci tabella per la </w:t>
+      </w:r>
+      <w:proofErr w:type="spellStart"/>
+      <w:r>
+        <w:t>userconfig</w:t>
+      </w:r>
+      <w:proofErr w:type="spellEnd"/>
+      <w:r>
+        <w:t>.</w:t>
+      </w:r>
+    </w:p>
+    <w:p>
+      <w:pPr>
+        <w:pStyle w:val="Paragrafoelenco"/>
+        <w:numPr>
+          <w:ilvl w:val="0"/>
+          <w:numId w:val="1"/>
+        </w:numPr>
+      </w:pPr>
+      <w:r>
+        <w:t>Che c’è una video chiamata in corso lo capisco.. ovvero se uno dei due ha avviato la sessione?</w:t>
+      </w:r>
+    </w:p>
+    <w:p>
+      <w:pPr>
+        <w:pStyle w:val="Paragrafoelenco"/>
+        <w:numPr>
+          <w:ilvl w:val="0"/>
+          <w:numId w:val="1"/>
+        </w:numPr>
+      </w:pPr>
+      <w:r>
+        <w:t xml:space="preserve">Se clicco nuovo appuntamento come coach </w:t>
+      </w:r>
+      <w:proofErr w:type="spellStart"/>
+      <w:r>
+        <w:t>dche</w:t>
+      </w:r>
+      <w:proofErr w:type="spellEnd"/>
+      <w:r>
+        <w:t xml:space="preserve"> atleti devo vedere, e se faccio la stessa cosa come atleta che devo vedere?</w:t>
+      </w:r>
+    </w:p>
+    <w:p>
+      <w:pPr>
+        <w:pStyle w:val="Paragrafoelenco"/>
+        <w:numPr>
+          <w:ilvl w:val="0"/>
+          <w:numId w:val="1"/>
+        </w:numPr>
+      </w:pPr>
+      <w:r>
+        <w:t>Gestione password dimenticata da verificare se funziona tutto .</w:t>
+      </w:r>
+    </w:p>
+    <w:p>
+      <w:pPr>
+        <w:pStyle w:val="Paragrafoelenco"/>
+        <w:numPr>
+          <w:ilvl w:val="0"/>
+          <w:numId w:val="1"/>
+        </w:numPr>
+      </w:pPr>
+    </w:p>
+    <w:p>
+      <w:pPr>
+        <w:ind w:left="360"/>
+        <w:rPr>
+          <w:strike/>
+        </w:rPr>
+      </w:pPr>
+    </w:p>
+    <w:p>
+      <w:r>
+        <w:t>Marketing</w:t>
+      </w:r>
+    </w:p>
+    <w:p>
+      <w:pPr>
+        <w:pStyle w:val="Paragrafoelenco"/>
+        <w:numPr>
+          <w:ilvl w:val="0"/>
+          <w:numId w:val="1"/>
+        </w:numPr>
+      </w:pPr>
+      <w:r>
+        <w:t>Recensioni nella landing page</w:t>
+      </w:r>
+    </w:p>
+    <w:p>
+      <w:pPr>
+        <w:pStyle w:val="Paragrafoelenco"/>
+        <w:numPr>
+          <w:ilvl w:val="0"/>
+          <w:numId w:val="1"/>
+        </w:numPr>
+        <w:rPr>
+          <w:strike/>
+        </w:rPr>
+      </w:pPr>
+      <w:r>
+        <w:rPr>
+          <w:strike/>
+        </w:rPr>
         <w:t xml:space="preserve">Dominio, </w:t>
       </w:r>
       <w:proofErr w:type="spellStart"/>
       <w:r>
+        <w:rPr>
+          <w:strike/>
+        </w:rPr>
         <w:t>supabase</w:t>
       </w:r>
       <w:proofErr w:type="spellEnd"/>
       <w:r>
+        <w:rPr>
+          <w:strike/>
+        </w:rPr>
         <w:t xml:space="preserve">, </w:t>
       </w:r>
       <w:proofErr w:type="spellStart"/>
       <w:r>
+        <w:rPr>
+          <w:strike/>
+        </w:rPr>
         <w:t>resend</w:t>
       </w:r>
       <w:proofErr w:type="spellEnd"/>
       <w:r>
+        <w:rPr>
+          <w:strike/>
+        </w:rPr>
         <w:t>, Webcam.</w:t>
       </w:r>
     </w:p>
@@ -281,7 +611,7 @@
         </w:numPr>
       </w:pPr>
       <w:r>
-        <w:t xml:space="preserve"> landing page un CTA ‘registrati gratis’ o anche un ‘invita un </w:t>
+        <w:t xml:space="preserve">landing page un CTA ‘registrati gratis’ o anche un ‘invita un </w:t>
       </w:r>
       <w:proofErr w:type="spellStart"/>
       <w:r>
@@ -306,13 +636,11 @@
         </w:numPr>
         <w:rPr>
           <w:strike/>
-          <w:color w:val="EE0000"/>
-        </w:rPr>
-      </w:pPr>
-      <w:r>
-        <w:rPr>
-          <w:strike/>
-          <w:color w:val="EE0000"/>
+        </w:rPr>
+      </w:pPr>
+      <w:r>
+        <w:rPr>
+          <w:strike/>
         </w:rPr>
         <w:t xml:space="preserve">Come atleta quando devo entrare in una call mi piacerebbe avere la card bella come quella che ha il </w:t>
       </w:r>
@@ -320,7 +648,6 @@
       <w:r>
         <w:rPr>
           <w:strike/>
-          <w:color w:val="EE0000"/>
         </w:rPr>
         <w:t>caoch</w:t>
       </w:r>
@@ -328,7 +655,6 @@
       <w:r>
         <w:rPr>
           <w:strike/>
-          <w:color w:val="EE0000"/>
         </w:rPr>
         <w:t xml:space="preserve"> con la foto </w:t>
       </w:r>
@@ -336,7 +662,6 @@
       <w:r>
         <w:rPr>
           <w:strike/>
-          <w:color w:val="EE0000"/>
         </w:rPr>
         <w:t>etcc</w:t>
       </w:r>
@@ -344,7 +669,6 @@
       <w:r>
         <w:rPr>
           <w:strike/>
-          <w:color w:val="EE0000"/>
         </w:rPr>
         <w:t>.</w:t>
       </w:r>
@@ -357,170 +681,12 @@
           <w:numId w:val="1"/>
         </w:numPr>
         <w:rPr>
-          <w:color w:val="EE0000"/>
-        </w:rPr>
-      </w:pPr>
-      <w:r>
-        <w:rPr>
-          <w:color w:val="EE0000"/>
-        </w:rPr>
-        <w:t>Che c’è una video chiamata in corso lo capisco.. ovvero se uno dei due ha avviato la sessione?</w:t>
-      </w:r>
-    </w:p>
-    <w:p>
-      <w:pPr>
-        <w:pStyle w:val="Paragrafoelenco"/>
-        <w:numPr>
-          <w:ilvl w:val="0"/>
-          <w:numId w:val="1"/>
-        </w:numPr>
-        <w:rPr>
-          <w:color w:val="EE0000"/>
-        </w:rPr>
-      </w:pPr>
-      <w:r>
-        <w:rPr>
-          <w:color w:val="EE0000"/>
-        </w:rPr>
-        <w:t>Liberatoria manleva di registrazione call sia video che audio per scopi accademici che per scopi antifrode per valutare se le persone si mettono d’accordo per uscire dalla piattaforma…</w:t>
-      </w:r>
-    </w:p>
-    <w:p>
-      <w:pPr>
-        <w:pStyle w:val="Paragrafoelenco"/>
-        <w:numPr>
-          <w:ilvl w:val="0"/>
-          <w:numId w:val="1"/>
-        </w:numPr>
-        <w:rPr>
-          <w:color w:val="EE0000"/>
-        </w:rPr>
-      </w:pPr>
-      <w:r>
-        <w:rPr>
-          <w:color w:val="EE0000"/>
-        </w:rPr>
-        <w:t xml:space="preserve">La parte </w:t>
-      </w:r>
-      <w:proofErr w:type="spellStart"/>
-      <w:r>
-        <w:rPr>
-          <w:color w:val="EE0000"/>
-        </w:rPr>
-        <w:t>legal</w:t>
-      </w:r>
-      <w:proofErr w:type="spellEnd"/>
-      <w:r>
-        <w:rPr>
-          <w:color w:val="EE0000"/>
-        </w:rPr>
-        <w:t xml:space="preserve"> da fare c’è la lista della spesa e fare </w:t>
-      </w:r>
-      <w:r>
-        <w:rPr>
-          <w:color w:val="EE0000"/>
-        </w:rPr>
-        <w:t>doc da far validare a Avvocato.</w:t>
-      </w:r>
-    </w:p>
-    <w:p>
-      <w:pPr>
-        <w:pStyle w:val="Paragrafoelenco"/>
-        <w:numPr>
-          <w:ilvl w:val="0"/>
-          <w:numId w:val="1"/>
-        </w:numPr>
-        <w:rPr>
-          <w:color w:val="EE0000"/>
-        </w:rPr>
-      </w:pPr>
-      <w:r>
-        <w:rPr>
-          <w:color w:val="EE0000"/>
-        </w:rPr>
-        <w:t>Podcast da valutare come sezione del sito..</w:t>
-      </w:r>
-    </w:p>
-    <w:p>
-      <w:pPr>
-        <w:pStyle w:val="Paragrafoelenco"/>
-        <w:numPr>
-          <w:ilvl w:val="0"/>
-          <w:numId w:val="1"/>
-        </w:numPr>
-        <w:rPr>
-          <w:color w:val="EE0000"/>
-        </w:rPr>
-      </w:pPr>
-      <w:r>
-        <w:rPr>
-          <w:color w:val="EE0000"/>
-        </w:rPr>
-        <w:t>Nuovo coach prevede si l’</w:t>
-      </w:r>
-      <w:proofErr w:type="spellStart"/>
-      <w:r>
-        <w:rPr>
-          <w:color w:val="EE0000"/>
-        </w:rPr>
-        <w:t>appovazione</w:t>
-      </w:r>
-      <w:proofErr w:type="spellEnd"/>
-      <w:r>
-        <w:rPr>
-          <w:color w:val="EE0000"/>
-        </w:rPr>
-        <w:t xml:space="preserve"> ma anche un colloquio conoscitivo (facoltativo). Tra il nuovo coach e l’admin.</w:t>
-      </w:r>
-    </w:p>
-    <w:p>
-      <w:pPr>
-        <w:pStyle w:val="Paragrafoelenco"/>
-        <w:numPr>
-          <w:ilvl w:val="0"/>
-          <w:numId w:val="1"/>
-        </w:numPr>
-        <w:rPr>
-          <w:color w:val="EE0000"/>
-        </w:rPr>
-      </w:pPr>
-      <w:r>
-        <w:rPr>
-          <w:color w:val="EE0000"/>
-        </w:rPr>
-        <w:t xml:space="preserve">Quando chiudo la sessione di chiamata mi è apparsa la pagina di login non so se è per un refuso o è un </w:t>
-      </w:r>
-      <w:proofErr w:type="spellStart"/>
-      <w:r>
-        <w:rPr>
-          <w:color w:val="EE0000"/>
-        </w:rPr>
-        <w:t>prob</w:t>
-      </w:r>
-      <w:proofErr w:type="spellEnd"/>
-      <w:r>
-        <w:rPr>
-          <w:color w:val="EE0000"/>
-        </w:rPr>
-        <w:t>?!</w:t>
-      </w:r>
-    </w:p>
-    <w:p>
-      <w:pPr>
-        <w:pStyle w:val="Paragrafoelenco"/>
-        <w:numPr>
-          <w:ilvl w:val="0"/>
-          <w:numId w:val="1"/>
-        </w:numPr>
-        <w:rPr>
-          <w:strike/>
-          <w:color w:val="EE0000"/>
-        </w:rPr>
-      </w:pPr>
-      <w:r>
-        <w:rPr>
-          <w:strike/>
-          <w:color w:val="EE0000"/>
+          <w:strike/>
+        </w:rPr>
+      </w:pPr>
+      <w:r>
+        <w:rPr>
+          <w:strike/>
         </w:rPr>
         <w:t xml:space="preserve">Se ricevo un </w:t>
       </w:r>
@@ -528,7 +694,6 @@
       <w:r>
         <w:rPr>
           <w:strike/>
-          <w:color w:val="EE0000"/>
         </w:rPr>
         <w:t>mess</w:t>
       </w:r>
@@ -536,7 +701,6 @@
       <w:r>
         <w:rPr>
           <w:strike/>
-          <w:color w:val="EE0000"/>
         </w:rPr>
         <w:t xml:space="preserve"> da app </w:t>
       </w:r>
@@ -544,7 +708,6 @@
       <w:r>
         <w:rPr>
           <w:strike/>
-          <w:color w:val="EE0000"/>
         </w:rPr>
         <w:t>moble</w:t>
       </w:r>
@@ -552,7 +715,6 @@
       <w:r>
         <w:rPr>
           <w:strike/>
-          <w:color w:val="EE0000"/>
         </w:rPr>
         <w:t xml:space="preserve"> mi appare il </w:t>
       </w:r>
@@ -560,7 +722,6 @@
       <w:r>
         <w:rPr>
           <w:strike/>
-          <w:color w:val="EE0000"/>
         </w:rPr>
         <w:t>mess</w:t>
       </w:r>
@@ -568,7 +729,6 @@
       <w:r>
         <w:rPr>
           <w:strike/>
-          <w:color w:val="EE0000"/>
         </w:rPr>
         <w:t xml:space="preserve">? O anche di un nuovo </w:t>
       </w:r>
@@ -576,7 +736,6 @@
       <w:r>
         <w:rPr>
           <w:strike/>
-          <w:color w:val="EE0000"/>
         </w:rPr>
         <w:t>mess</w:t>
       </w:r>
@@ -584,7 +743,6 @@
       <w:r>
         <w:rPr>
           <w:strike/>
-          <w:color w:val="EE0000"/>
         </w:rPr>
         <w:t xml:space="preserve"> da dentro l’app</w:t>
       </w:r>
@@ -597,647 +755,607 @@
           <w:numId w:val="1"/>
         </w:numPr>
         <w:rPr>
-          <w:color w:val="EE0000"/>
-        </w:rPr>
-      </w:pPr>
-      <w:r>
-        <w:rPr>
-          <w:color w:val="EE0000"/>
-        </w:rPr>
-        <w:t xml:space="preserve">Se le notifiche sono attive o no dovrà essere una configurazione a </w:t>
-      </w:r>
-      <w:proofErr w:type="spellStart"/>
-      <w:r>
-        <w:rPr>
-          <w:color w:val="EE0000"/>
-        </w:rPr>
-        <w:t>db</w:t>
-      </w:r>
-      <w:proofErr w:type="spellEnd"/>
-      <w:r>
-        <w:rPr>
-          <w:color w:val="EE0000"/>
-        </w:rPr>
-        <w:t xml:space="preserve"> dovrà esserci tabella per la </w:t>
-      </w:r>
-      <w:proofErr w:type="spellStart"/>
-      <w:r>
-        <w:rPr>
-          <w:color w:val="EE0000"/>
-        </w:rPr>
-        <w:t>userconfig</w:t>
-      </w:r>
-      <w:proofErr w:type="spellEnd"/>
-      <w:r>
-        <w:rPr>
-          <w:color w:val="EE0000"/>
+          <w:strike/>
+        </w:rPr>
+      </w:pPr>
+      <w:r>
+        <w:rPr>
+          <w:strike/>
+        </w:rPr>
+        <w:t xml:space="preserve">Levare tab </w:t>
+      </w:r>
+      <w:proofErr w:type="spellStart"/>
+      <w:r>
+        <w:rPr>
+          <w:strike/>
+        </w:rPr>
+        <w:t>order</w:t>
+      </w:r>
+      <w:proofErr w:type="spellEnd"/>
+      <w:r>
+        <w:rPr>
+          <w:strike/>
+        </w:rPr>
+        <w:t xml:space="preserve"> nella pagina di login</w:t>
+      </w:r>
+      <w:r>
+        <w:rPr>
+          <w:strike/>
+        </w:rPr>
+        <w:t xml:space="preserve"> alla x nel campo username e all’</w:t>
+      </w:r>
+      <w:proofErr w:type="spellStart"/>
+      <w:r>
+        <w:rPr>
+          <w:strike/>
+        </w:rPr>
+        <w:t>occhilino</w:t>
+      </w:r>
+      <w:proofErr w:type="spellEnd"/>
+      <w:r>
+        <w:rPr>
+          <w:strike/>
+        </w:rPr>
+        <w:t xml:space="preserve"> nella password</w:t>
+      </w:r>
+      <w:r>
+        <w:rPr>
+          <w:strike/>
+        </w:rPr>
+        <w:t xml:space="preserve">, </w:t>
+      </w:r>
+    </w:p>
+    <w:p>
+      <w:pPr>
+        <w:pStyle w:val="Paragrafoelenco"/>
+        <w:numPr>
+          <w:ilvl w:val="0"/>
+          <w:numId w:val="1"/>
+        </w:numPr>
+        <w:rPr>
+          <w:strike/>
+        </w:rPr>
+      </w:pPr>
+      <w:r>
+        <w:rPr>
+          <w:strike/>
+        </w:rPr>
+        <w:t>Campanellina notifiche scompare nella pagina ricerca coach</w:t>
+      </w:r>
+      <w:r>
+        <w:rPr>
+          <w:strike/>
+        </w:rPr>
+        <w:t>, invece deve esserci</w:t>
+      </w:r>
+    </w:p>
+    <w:p>
+      <w:pPr>
+        <w:pStyle w:val="Paragrafoelenco"/>
+        <w:numPr>
+          <w:ilvl w:val="0"/>
+          <w:numId w:val="1"/>
+        </w:numPr>
+        <w:rPr>
+          <w:strike/>
+        </w:rPr>
+      </w:pPr>
+      <w:r>
+        <w:rPr>
+          <w:strike/>
+        </w:rPr>
+        <w:t xml:space="preserve">Menu utente, se lo apro e clicco su </w:t>
+      </w:r>
+      <w:proofErr w:type="spellStart"/>
+      <w:r>
+        <w:rPr>
+          <w:strike/>
+        </w:rPr>
+        <w:t>qlc</w:t>
+      </w:r>
+      <w:proofErr w:type="spellEnd"/>
+      <w:r>
+        <w:rPr>
+          <w:strike/>
+        </w:rPr>
+        <w:t xml:space="preserve"> deve scomparire</w:t>
+      </w:r>
+    </w:p>
+    <w:p>
+      <w:pPr>
+        <w:pStyle w:val="Paragrafoelenco"/>
+        <w:numPr>
+          <w:ilvl w:val="0"/>
+          <w:numId w:val="1"/>
+        </w:numPr>
+        <w:rPr>
+          <w:strike/>
+        </w:rPr>
+      </w:pPr>
+      <w:r>
+        <w:rPr>
+          <w:strike/>
+        </w:rPr>
+        <w:t xml:space="preserve">Il cambio dello </w:t>
+      </w:r>
+      <w:proofErr w:type="spellStart"/>
+      <w:r>
+        <w:rPr>
+          <w:strike/>
+        </w:rPr>
+        <w:t>sfotno</w:t>
+      </w:r>
+      <w:proofErr w:type="spellEnd"/>
+      <w:r>
+        <w:rPr>
+          <w:strike/>
+        </w:rPr>
+        <w:t xml:space="preserve"> lo dovrei poter fare anche nella sala d’attesa</w:t>
+      </w:r>
+    </w:p>
+    <w:p>
+      <w:pPr>
+        <w:pStyle w:val="Paragrafoelenco"/>
+        <w:numPr>
+          <w:ilvl w:val="0"/>
+          <w:numId w:val="1"/>
+        </w:numPr>
+        <w:rPr>
+          <w:strike/>
+        </w:rPr>
+      </w:pPr>
+      <w:r>
+        <w:rPr>
+          <w:strike/>
+        </w:rPr>
+        <w:t xml:space="preserve">Se apro finestra </w:t>
+      </w:r>
+      <w:proofErr w:type="spellStart"/>
+      <w:r>
+        <w:rPr>
+          <w:strike/>
+        </w:rPr>
+        <w:t>setupd</w:t>
+      </w:r>
+      <w:proofErr w:type="spellEnd"/>
+      <w:r>
+        <w:rPr>
+          <w:strike/>
+        </w:rPr>
+        <w:t xml:space="preserve"> camera microfono </w:t>
+      </w:r>
+      <w:proofErr w:type="spellStart"/>
+      <w:r>
+        <w:rPr>
+          <w:strike/>
+        </w:rPr>
+        <w:t>etcc</w:t>
+      </w:r>
+      <w:proofErr w:type="spellEnd"/>
+      <w:r>
+        <w:rPr>
+          <w:strike/>
+        </w:rPr>
+        <w:t xml:space="preserve"> non posso </w:t>
+      </w:r>
+      <w:proofErr w:type="spellStart"/>
+      <w:r>
+        <w:rPr>
+          <w:strike/>
+        </w:rPr>
+        <w:t>chiuderela</w:t>
+      </w:r>
+      <w:proofErr w:type="spellEnd"/>
+      <w:r>
+        <w:rPr>
+          <w:strike/>
         </w:rPr>
         <w:t>.</w:t>
       </w:r>
     </w:p>
     <w:p>
       <w:pPr>
-        <w:pStyle w:val="Paragrafoelenco"/>
-        <w:numPr>
-          <w:ilvl w:val="0"/>
-          <w:numId w:val="1"/>
-        </w:numPr>
-        <w:rPr>
-          <w:color w:val="EE0000"/>
-        </w:rPr>
-      </w:pPr>
-      <w:r>
-        <w:rPr>
-          <w:color w:val="EE0000"/>
-        </w:rPr>
-        <w:t xml:space="preserve">Se clicco nuovo appuntamento come coach </w:t>
-      </w:r>
-      <w:proofErr w:type="spellStart"/>
-      <w:r>
-        <w:rPr>
-          <w:color w:val="EE0000"/>
-        </w:rPr>
-        <w:t>dche</w:t>
-      </w:r>
-      <w:proofErr w:type="spellEnd"/>
-      <w:r>
-        <w:rPr>
-          <w:color w:val="EE0000"/>
-        </w:rPr>
-        <w:t xml:space="preserve"> atleti devo vedere, e se faccio la stessa cosa come atleta che devo vedere?</w:t>
-      </w:r>
-    </w:p>
-    <w:p>
-      <w:pPr>
-        <w:pStyle w:val="Paragrafoelenco"/>
-        <w:numPr>
-          <w:ilvl w:val="0"/>
-          <w:numId w:val="1"/>
-        </w:numPr>
-        <w:rPr>
-          <w:color w:val="EE0000"/>
-        </w:rPr>
-      </w:pPr>
-      <w:r>
-        <w:rPr>
-          <w:color w:val="EE0000"/>
-        </w:rPr>
-        <w:t xml:space="preserve">Minore registrazione, dice che servirà autorizzazione del genitore ma anche se non c’è fa creare </w:t>
-      </w:r>
-      <w:proofErr w:type="spellStart"/>
-      <w:r>
-        <w:rPr>
-          <w:color w:val="EE0000"/>
-        </w:rPr>
-        <w:t>ee</w:t>
-      </w:r>
-      <w:proofErr w:type="spellEnd"/>
-      <w:r>
-        <w:rPr>
-          <w:color w:val="EE0000"/>
-        </w:rPr>
-        <w:t xml:space="preserve"> pianificare appuntamenti e non va bene … l’approvazione del genitore sono campi testo libero e non va bene va acqua da tutte le parti, ma gli altri che fanno?</w:t>
-      </w:r>
-    </w:p>
-    <w:p>
-      <w:pPr>
-        <w:pStyle w:val="Paragrafoelenco"/>
-        <w:numPr>
-          <w:ilvl w:val="0"/>
-          <w:numId w:val="1"/>
-        </w:numPr>
-        <w:rPr>
-          <w:color w:val="EE0000"/>
-        </w:rPr>
-      </w:pPr>
-      <w:r>
-        <w:rPr>
-          <w:color w:val="EE0000"/>
-        </w:rPr>
-        <w:t>Se mi registro e modifico la data di nascita e mi metto minorenne il sistema dovrebbe bloccarmi non salvare modifiche della data se la nuova data diventa minorenne.</w:t>
-      </w:r>
-    </w:p>
-    <w:p>
-      <w:pPr>
-        <w:pStyle w:val="Paragrafoelenco"/>
-        <w:numPr>
-          <w:ilvl w:val="0"/>
-          <w:numId w:val="1"/>
-        </w:numPr>
-        <w:rPr>
-          <w:color w:val="EE0000"/>
-        </w:rPr>
-      </w:pPr>
-      <w:r>
-        <w:rPr>
-          <w:color w:val="EE0000"/>
-        </w:rPr>
-        <w:t xml:space="preserve">Impatti nome dominio su link interni su </w:t>
-      </w:r>
-      <w:proofErr w:type="spellStart"/>
-      <w:r>
-        <w:rPr>
-          <w:color w:val="EE0000"/>
-        </w:rPr>
-        <w:t>referal</w:t>
-      </w:r>
-      <w:proofErr w:type="spellEnd"/>
-      <w:r>
-        <w:rPr>
-          <w:color w:val="EE0000"/>
-        </w:rPr>
-        <w:t xml:space="preserve"> su invita un amico..</w:t>
-      </w:r>
-    </w:p>
-    <w:p>
-      <w:pPr>
-        <w:pStyle w:val="Paragrafoelenco"/>
-        <w:numPr>
-          <w:ilvl w:val="0"/>
-          <w:numId w:val="1"/>
-        </w:numPr>
-        <w:rPr>
-          <w:strike/>
-          <w:color w:val="EE0000"/>
-        </w:rPr>
-      </w:pPr>
-      <w:r>
-        <w:rPr>
-          <w:strike/>
-          <w:color w:val="EE0000"/>
-        </w:rPr>
-        <w:t xml:space="preserve">Levare tab </w:t>
-      </w:r>
-      <w:proofErr w:type="spellStart"/>
-      <w:r>
-        <w:rPr>
-          <w:strike/>
-          <w:color w:val="EE0000"/>
+        <w:ind w:left="360"/>
+      </w:pPr>
+    </w:p>
+    <w:p>
+      <w:pPr>
+        <w:ind w:left="360"/>
+      </w:pPr>
+      <w:r>
+        <w:t>Pa</w:t>
+      </w:r>
+      <w:r>
+        <w:t xml:space="preserve">rte AI, trascrizione strutturazione riepilogo, </w:t>
+      </w:r>
+      <w:proofErr w:type="spellStart"/>
+      <w:r>
+        <w:t>aiunto</w:t>
+      </w:r>
+      <w:proofErr w:type="spellEnd"/>
+      <w:r>
+        <w:t xml:space="preserve"> </w:t>
+      </w:r>
+      <w:proofErr w:type="spellStart"/>
+      <w:r>
+        <w:t>next</w:t>
+      </w:r>
+      <w:proofErr w:type="spellEnd"/>
+      <w:r>
+        <w:t xml:space="preserve"> action , preparazione prossimo meeting</w:t>
+      </w:r>
+    </w:p>
+    <w:p>
+      <w:pPr>
+        <w:ind w:left="360"/>
+      </w:pPr>
+      <w:proofErr w:type="spellStart"/>
+      <w:r>
+        <w:t>Referal</w:t>
+      </w:r>
+      <w:proofErr w:type="spellEnd"/>
+      <w:r>
+        <w:t xml:space="preserve"> company</w:t>
+      </w:r>
+    </w:p>
+    <w:p>
+      <w:pPr>
+        <w:ind w:left="360"/>
+      </w:pPr>
+      <w:r>
+        <w:t xml:space="preserve">La parte di marketing la ferie partire </w:t>
+      </w:r>
+      <w:proofErr w:type="spellStart"/>
+      <w:r>
+        <w:t>quand</w:t>
+      </w:r>
+      <w:proofErr w:type="spellEnd"/>
+      <w:r>
+        <w:t>:</w:t>
+      </w:r>
+    </w:p>
+    <w:p>
+      <w:pPr>
+        <w:ind w:left="360" w:firstLine="348"/>
+      </w:pPr>
+      <w:r>
+        <w:t xml:space="preserve">Landing ottimizzata, ci sono un </w:t>
+      </w:r>
+      <w:proofErr w:type="spellStart"/>
+      <w:r>
+        <w:t>po</w:t>
+      </w:r>
+      <w:proofErr w:type="spellEnd"/>
+      <w:r>
+        <w:t xml:space="preserve"> di coach che usano la piattaforma. Parte pagamenti attiva, notifiche e dominio registrato, parte Legal fatta</w:t>
+      </w:r>
+    </w:p>
+    <w:p>
+      <w:pPr>
+        <w:ind w:left="360" w:firstLine="348"/>
+      </w:pPr>
+      <w:r>
+        <w:t xml:space="preserve">Un domani il sito deve avere immagini in </w:t>
+      </w:r>
+      <w:proofErr w:type="spellStart"/>
+      <w:r>
+        <w:t>backgroud</w:t>
+      </w:r>
+      <w:proofErr w:type="spellEnd"/>
+      <w:r>
+        <w:t xml:space="preserve"> in base allo sport dell’atleta. Nella </w:t>
+      </w:r>
+      <w:proofErr w:type="spellStart"/>
+      <w:r>
+        <w:t>dashbaord</w:t>
+      </w:r>
+      <w:proofErr w:type="spellEnd"/>
+      <w:r>
+        <w:t xml:space="preserve"> </w:t>
+      </w:r>
+      <w:proofErr w:type="spellStart"/>
+      <w:r>
+        <w:t>etcc</w:t>
+      </w:r>
+      <w:proofErr w:type="spellEnd"/>
+      <w:r>
+        <w:t>.</w:t>
+      </w:r>
+    </w:p>
+    <w:p>
+      <w:pPr>
+        <w:ind w:left="360" w:firstLine="348"/>
+      </w:pPr>
+      <w:r>
+        <w:t>Nella landing mettere recensioni testimonial</w:t>
+      </w:r>
+    </w:p>
+    <w:p>
+      <w:pPr>
+        <w:rPr>
+          <w:b/>
+          <w:bCs/>
+        </w:rPr>
+      </w:pPr>
+    </w:p>
+    <w:p>
+      <w:pPr>
+        <w:rPr>
+          <w:b/>
+          <w:bCs/>
+        </w:rPr>
+      </w:pPr>
+      <w:r>
+        <w:rPr>
+          <w:b/>
+          <w:bCs/>
+        </w:rPr>
+        <w:t>Pip</w:t>
+      </w:r>
+    </w:p>
+    <w:p>
+      <w:pPr>
+        <w:rPr>
+          <w:b/>
+          <w:bCs/>
+        </w:rPr>
+      </w:pPr>
+      <w:r>
+        <w:rPr>
+          <w:b/>
+          <w:bCs/>
+        </w:rPr>
+        <w:t xml:space="preserve"> mobile.</w:t>
+      </w:r>
+    </w:p>
+    <w:p>
+      <w:pPr>
+        <w:rPr>
+          <w:b/>
+          <w:bCs/>
+        </w:rPr>
+      </w:pPr>
+      <w:r>
+        <w:rPr>
+          <w:b/>
+          <w:bCs/>
+        </w:rPr>
+        <w:t>Share da mobile non c'è.</w:t>
+      </w:r>
+    </w:p>
+    <w:p>
+      <w:pPr>
+        <w:rPr>
+          <w:b/>
+          <w:bCs/>
+        </w:rPr>
+      </w:pPr>
+      <w:r>
+        <w:rPr>
+          <w:b/>
+          <w:bCs/>
+        </w:rPr>
+        <w:t>Chiamata popup che suona...</w:t>
+      </w:r>
+    </w:p>
+    <w:p>
+      <w:pPr>
+        <w:rPr>
+          <w:b/>
+          <w:bCs/>
+        </w:rPr>
+      </w:pPr>
+      <w:r>
+        <w:rPr>
+          <w:b/>
+          <w:bCs/>
+        </w:rPr>
+        <w:t xml:space="preserve">I segnalibri se ne </w:t>
+      </w:r>
+      <w:proofErr w:type="spellStart"/>
+      <w:r>
+        <w:rPr>
+          <w:b/>
+          <w:bCs/>
+        </w:rPr>
+        <w:t>puo</w:t>
+      </w:r>
+      <w:proofErr w:type="spellEnd"/>
+      <w:r>
+        <w:rPr>
+          <w:b/>
+          <w:bCs/>
+        </w:rPr>
+        <w:t xml:space="preserve"> marcare </w:t>
+      </w:r>
+      <w:proofErr w:type="spellStart"/>
+      <w:r>
+        <w:rPr>
+          <w:b/>
+          <w:bCs/>
+        </w:rPr>
+        <w:t>piu</w:t>
+      </w:r>
+      <w:proofErr w:type="spellEnd"/>
+      <w:r>
+        <w:rPr>
+          <w:b/>
+          <w:bCs/>
+        </w:rPr>
+        <w:t xml:space="preserve"> di uno? si.</w:t>
+      </w:r>
+    </w:p>
+    <w:p>
+      <w:pPr>
+        <w:rPr>
+          <w:b/>
+          <w:bCs/>
+        </w:rPr>
+      </w:pPr>
+    </w:p>
+    <w:p>
+      <w:pPr>
+        <w:rPr>
+          <w:b/>
+          <w:bCs/>
+        </w:rPr>
+      </w:pPr>
+      <w:r>
+        <w:rPr>
+          <w:b/>
+          <w:bCs/>
+        </w:rPr>
+        <w:t xml:space="preserve">mobile </w:t>
+      </w:r>
+      <w:proofErr w:type="spellStart"/>
+      <w:r>
+        <w:rPr>
+          <w:b/>
+          <w:bCs/>
+        </w:rPr>
+        <w:t>android</w:t>
+      </w:r>
+      <w:proofErr w:type="spellEnd"/>
+      <w:r>
+        <w:rPr>
+          <w:b/>
+          <w:bCs/>
+        </w:rPr>
+        <w:t>:</w:t>
+      </w:r>
+    </w:p>
+    <w:p>
+      <w:pPr>
+        <w:rPr>
+          <w:b/>
+          <w:bCs/>
+        </w:rPr>
+      </w:pPr>
+      <w:r>
+        <w:rPr>
+          <w:b/>
+          <w:bCs/>
+        </w:rPr>
+        <w:t xml:space="preserve">Splash screen con </w:t>
+      </w:r>
+      <w:proofErr w:type="spellStart"/>
+      <w:r>
+        <w:rPr>
+          <w:b/>
+          <w:bCs/>
+        </w:rPr>
+        <w:t>faceid</w:t>
+      </w:r>
+      <w:proofErr w:type="spellEnd"/>
+    </w:p>
+    <w:p>
+      <w:pPr>
+        <w:rPr>
+          <w:b/>
+          <w:bCs/>
+        </w:rPr>
+      </w:pPr>
+      <w:r>
+        <w:rPr>
+          <w:b/>
+          <w:bCs/>
+        </w:rPr>
+        <w:t xml:space="preserve">pagina di login deve avere il logo e se non erro anche link a </w:t>
+      </w:r>
+      <w:proofErr w:type="spellStart"/>
+      <w:r>
+        <w:rPr>
+          <w:b/>
+          <w:bCs/>
+        </w:rPr>
+        <w:t>term&amp;condition</w:t>
+      </w:r>
+      <w:proofErr w:type="spellEnd"/>
+      <w:r>
+        <w:rPr>
+          <w:b/>
+          <w:bCs/>
+        </w:rPr>
+        <w:t xml:space="preserve"> </w:t>
+      </w:r>
+      <w:proofErr w:type="spellStart"/>
+      <w:r>
+        <w:rPr>
+          <w:b/>
+          <w:bCs/>
+        </w:rPr>
+        <w:t>etcc</w:t>
+      </w:r>
+      <w:proofErr w:type="spellEnd"/>
+    </w:p>
+    <w:p>
+      <w:pPr>
+        <w:rPr>
+          <w:b/>
+          <w:bCs/>
+        </w:rPr>
+      </w:pPr>
+      <w:r>
+        <w:rPr>
+          <w:b/>
+          <w:bCs/>
+        </w:rPr>
+        <w:t xml:space="preserve">tab </w:t>
+      </w:r>
+      <w:proofErr w:type="spellStart"/>
+      <w:r>
+        <w:rPr>
+          <w:b/>
+          <w:bCs/>
         </w:rPr>
         <w:t>order</w:t>
       </w:r>
       <w:proofErr w:type="spellEnd"/>
       <w:r>
         <w:rPr>
-          <w:strike/>
-          <w:color w:val="EE0000"/>
-        </w:rPr>
-        <w:t xml:space="preserve"> nella pagina di login</w:t>
-      </w:r>
-      <w:r>
-        <w:rPr>
-          <w:strike/>
-          <w:color w:val="EE0000"/>
-        </w:rPr>
-        <w:t xml:space="preserve"> alla x nel campo username e all’</w:t>
-      </w:r>
-      <w:proofErr w:type="spellStart"/>
-      <w:r>
-        <w:rPr>
-          <w:strike/>
-          <w:color w:val="EE0000"/>
-        </w:rPr>
-        <w:t>occhilino</w:t>
-      </w:r>
-      <w:proofErr w:type="spellEnd"/>
-      <w:r>
-        <w:rPr>
-          <w:strike/>
-          <w:color w:val="EE0000"/>
-        </w:rPr>
-        <w:t xml:space="preserve"> nella password</w:t>
-      </w:r>
-      <w:r>
-        <w:rPr>
-          <w:strike/>
-          <w:color w:val="EE0000"/>
-        </w:rPr>
-        <w:t xml:space="preserve">, </w:t>
-      </w:r>
-    </w:p>
-    <w:p>
-      <w:pPr>
-        <w:pStyle w:val="Paragrafoelenco"/>
-        <w:numPr>
-          <w:ilvl w:val="0"/>
-          <w:numId w:val="1"/>
-        </w:numPr>
-        <w:rPr>
-          <w:color w:val="EE0000"/>
-        </w:rPr>
-      </w:pPr>
-      <w:r>
-        <w:rPr>
-          <w:color w:val="EE0000"/>
-        </w:rPr>
-        <w:t>Campanellina notifiche scompare nella pagina ricerca coach</w:t>
-      </w:r>
-      <w:r>
-        <w:rPr>
-          <w:color w:val="EE0000"/>
-        </w:rPr>
-        <w:t>, invece deve esserci</w:t>
-      </w:r>
-    </w:p>
-    <w:p>
-      <w:pPr>
-        <w:pStyle w:val="Paragrafoelenco"/>
-        <w:numPr>
-          <w:ilvl w:val="0"/>
-          <w:numId w:val="1"/>
-        </w:numPr>
-        <w:rPr>
-          <w:color w:val="EE0000"/>
-        </w:rPr>
-      </w:pPr>
-      <w:r>
-        <w:rPr>
-          <w:color w:val="EE0000"/>
-        </w:rPr>
-        <w:t>Gestione password dimenticata.</w:t>
-      </w:r>
-    </w:p>
-    <w:p>
-      <w:pPr>
-        <w:pStyle w:val="Paragrafoelenco"/>
-        <w:numPr>
-          <w:ilvl w:val="0"/>
-          <w:numId w:val="1"/>
-        </w:numPr>
-        <w:rPr>
-          <w:strike/>
-          <w:color w:val="EE0000"/>
-        </w:rPr>
-      </w:pPr>
-      <w:r>
-        <w:rPr>
-          <w:strike/>
-          <w:color w:val="EE0000"/>
-        </w:rPr>
-        <w:t xml:space="preserve">Menu utente, se lo apro e clicco su </w:t>
-      </w:r>
-      <w:proofErr w:type="spellStart"/>
-      <w:r>
-        <w:rPr>
-          <w:strike/>
-          <w:color w:val="EE0000"/>
-        </w:rPr>
-        <w:t>qlc</w:t>
-      </w:r>
-      <w:proofErr w:type="spellEnd"/>
-      <w:r>
-        <w:rPr>
-          <w:strike/>
-          <w:color w:val="EE0000"/>
-        </w:rPr>
-        <w:t xml:space="preserve"> deve scomparire</w:t>
-      </w:r>
-    </w:p>
-    <w:p>
-      <w:pPr>
-        <w:pStyle w:val="Paragrafoelenco"/>
-        <w:numPr>
-          <w:ilvl w:val="0"/>
-          <w:numId w:val="1"/>
-        </w:numPr>
-        <w:rPr>
-          <w:color w:val="EE0000"/>
-        </w:rPr>
-      </w:pPr>
-      <w:r>
-        <w:rPr>
-          <w:color w:val="EE0000"/>
-        </w:rPr>
-        <w:t>Il profilo è rosso con le iniziali valutare se non è meglio immagine se presente</w:t>
-      </w:r>
-    </w:p>
-    <w:p>
-      <w:pPr>
-        <w:pStyle w:val="Paragrafoelenco"/>
-        <w:numPr>
-          <w:ilvl w:val="0"/>
-          <w:numId w:val="1"/>
-        </w:numPr>
-        <w:rPr>
-          <w:strike/>
-          <w:color w:val="EE0000"/>
-        </w:rPr>
-      </w:pPr>
-      <w:r>
-        <w:rPr>
-          <w:strike/>
-          <w:color w:val="EE0000"/>
+          <w:b/>
+          <w:bCs/>
+        </w:rPr>
+        <w:t xml:space="preserve"> nome utente e password</w:t>
+      </w:r>
+    </w:p>
+    <w:p>
+      <w:pPr>
+        <w:rPr>
+          <w:b/>
+          <w:bCs/>
+        </w:rPr>
+      </w:pPr>
+    </w:p>
+    <w:p>
+      <w:pPr>
+        <w:rPr>
+          <w:b/>
+          <w:bCs/>
+        </w:rPr>
+      </w:pPr>
+      <w:r>
+        <w:rPr>
+          <w:b/>
+          <w:bCs/>
         </w:rPr>
         <w:lastRenderedPageBreak/>
-        <w:t xml:space="preserve">Il cambio dello </w:t>
-      </w:r>
-      <w:proofErr w:type="spellStart"/>
-      <w:r>
-        <w:rPr>
-          <w:strike/>
-          <w:color w:val="EE0000"/>
-        </w:rPr>
-        <w:t>sfotno</w:t>
-      </w:r>
-      <w:proofErr w:type="spellEnd"/>
-      <w:r>
-        <w:rPr>
-          <w:strike/>
-          <w:color w:val="EE0000"/>
-        </w:rPr>
-        <w:t xml:space="preserve"> lo dovrei poter fare anche nella sala d’attesa</w:t>
-      </w:r>
-    </w:p>
-    <w:p>
-      <w:pPr>
-        <w:pStyle w:val="Paragrafoelenco"/>
-        <w:numPr>
-          <w:ilvl w:val="0"/>
-          <w:numId w:val="1"/>
-        </w:numPr>
-        <w:rPr>
-          <w:strike/>
-          <w:color w:val="EE0000"/>
-        </w:rPr>
-      </w:pPr>
-      <w:r>
-        <w:rPr>
-          <w:strike/>
-          <w:color w:val="EE0000"/>
-        </w:rPr>
-        <w:t xml:space="preserve">Se apro finestra </w:t>
-      </w:r>
-      <w:proofErr w:type="spellStart"/>
-      <w:r>
-        <w:rPr>
-          <w:strike/>
-          <w:color w:val="EE0000"/>
-        </w:rPr>
-        <w:t>setupd</w:t>
-      </w:r>
-      <w:proofErr w:type="spellEnd"/>
-      <w:r>
-        <w:rPr>
-          <w:strike/>
-          <w:color w:val="EE0000"/>
-        </w:rPr>
-        <w:t xml:space="preserve"> camera microfono </w:t>
-      </w:r>
-      <w:proofErr w:type="spellStart"/>
-      <w:r>
-        <w:rPr>
-          <w:strike/>
-          <w:color w:val="EE0000"/>
-        </w:rPr>
-        <w:t>etcc</w:t>
-      </w:r>
-      <w:proofErr w:type="spellEnd"/>
-      <w:r>
-        <w:rPr>
-          <w:strike/>
-          <w:color w:val="EE0000"/>
-        </w:rPr>
-        <w:t xml:space="preserve"> non posso </w:t>
-      </w:r>
-      <w:proofErr w:type="spellStart"/>
-      <w:r>
-        <w:rPr>
-          <w:strike/>
-          <w:color w:val="EE0000"/>
-        </w:rPr>
-        <w:t>chiuderela</w:t>
-      </w:r>
-      <w:proofErr w:type="spellEnd"/>
-      <w:r>
-        <w:rPr>
-          <w:strike/>
-          <w:color w:val="EE0000"/>
-        </w:rPr>
-        <w:t>.</w:t>
-      </w:r>
-    </w:p>
-    <w:p>
-      <w:pPr>
-        <w:ind w:left="360"/>
-      </w:pPr>
-    </w:p>
-    <w:p>
-      <w:pPr>
-        <w:ind w:left="360"/>
-      </w:pPr>
-      <w:r>
-        <w:t>Pa</w:t>
-      </w:r>
-      <w:r>
-        <w:t xml:space="preserve">rte AI, trascrizione strutturazione riepilogo, </w:t>
-      </w:r>
-      <w:proofErr w:type="spellStart"/>
-      <w:r>
-        <w:t>aiunto</w:t>
-      </w:r>
-      <w:proofErr w:type="spellEnd"/>
-      <w:r>
-        <w:t xml:space="preserve"> </w:t>
-      </w:r>
-      <w:proofErr w:type="spellStart"/>
-      <w:r>
-        <w:t>next</w:t>
-      </w:r>
-      <w:proofErr w:type="spellEnd"/>
-      <w:r>
-        <w:t xml:space="preserve"> action , preparazione prossimo meeting</w:t>
-      </w:r>
-    </w:p>
-    <w:p>
-      <w:pPr>
-        <w:ind w:left="360"/>
-      </w:pPr>
-      <w:proofErr w:type="spellStart"/>
-      <w:r>
-        <w:t>Referal</w:t>
-      </w:r>
-      <w:proofErr w:type="spellEnd"/>
-      <w:r>
-        <w:t xml:space="preserve"> company</w:t>
-      </w:r>
-    </w:p>
-    <w:p>
-      <w:pPr>
-        <w:ind w:left="360"/>
-      </w:pPr>
-      <w:r>
-        <w:t xml:space="preserve">La parte di marketing la ferie partire </w:t>
-      </w:r>
-      <w:proofErr w:type="spellStart"/>
-      <w:r>
-        <w:t>quand</w:t>
-      </w:r>
-      <w:proofErr w:type="spellEnd"/>
-      <w:r>
-        <w:t>:</w:t>
-      </w:r>
-    </w:p>
-    <w:p>
-      <w:pPr>
-        <w:ind w:left="360" w:firstLine="348"/>
-      </w:pPr>
-      <w:r>
-        <w:t xml:space="preserve">Landing ottimizzata, ci sono un </w:t>
-      </w:r>
-      <w:proofErr w:type="spellStart"/>
-      <w:r>
-        <w:t>po</w:t>
-      </w:r>
-      <w:proofErr w:type="spellEnd"/>
-      <w:r>
-        <w:t xml:space="preserve"> di coach che usano la piattaforma. Parte pagamenti attiva, notifiche e dominio registrato, parte Legal fatta</w:t>
-      </w:r>
-    </w:p>
-    <w:p>
-      <w:pPr>
-        <w:ind w:left="360" w:firstLine="348"/>
-      </w:pPr>
-      <w:r>
-        <w:t xml:space="preserve">Un domani il sito deve avere immagini in </w:t>
-      </w:r>
-      <w:proofErr w:type="spellStart"/>
-      <w:r>
-        <w:t>backgroud</w:t>
-      </w:r>
-      <w:proofErr w:type="spellEnd"/>
-      <w:r>
-        <w:t xml:space="preserve"> in base allo sport dell’atleta. Nella </w:t>
-      </w:r>
-      <w:proofErr w:type="spellStart"/>
-      <w:r>
-        <w:t>dashbaord</w:t>
-      </w:r>
-      <w:proofErr w:type="spellEnd"/>
-      <w:r>
-        <w:t xml:space="preserve"> </w:t>
-      </w:r>
-      <w:proofErr w:type="spellStart"/>
-      <w:r>
-        <w:t>etcc</w:t>
-      </w:r>
-      <w:proofErr w:type="spellEnd"/>
-      <w:r>
-        <w:t>.</w:t>
-      </w:r>
-    </w:p>
-    <w:p>
-      <w:pPr>
-        <w:ind w:left="360" w:firstLine="348"/>
-      </w:pPr>
-      <w:r>
-        <w:t>Nella landing mettere recensioni testimonial</w:t>
-      </w:r>
-    </w:p>
-    <w:p>
-      <w:pPr>
-        <w:ind w:left="360" w:firstLine="348"/>
-      </w:pPr>
-    </w:p>
-    <w:p>
-      <w:pPr>
-        <w:ind w:left="360" w:firstLine="348"/>
-      </w:pPr>
-    </w:p>
-    <w:p>
-      <w:pPr>
-        <w:ind w:left="360" w:firstLine="348"/>
-      </w:pPr>
-    </w:p>
-    <w:p>
-      <w:pPr>
-        <w:pStyle w:val="Paragrafoelenco"/>
-      </w:pPr>
-    </w:p>
-    <w:p>
-      <w:pPr>
-        <w:rPr>
-          <w:b/>
-          <w:bCs/>
-        </w:rPr>
-      </w:pPr>
-      <w:r>
-        <w:rPr>
-          <w:b/>
-          <w:bCs/>
-        </w:rPr>
-        <w:t>Domande.</w:t>
-      </w:r>
-    </w:p>
-    <w:p>
-      <w:pPr>
-        <w:pStyle w:val="Paragrafoelenco"/>
-        <w:numPr>
-          <w:ilvl w:val="0"/>
-          <w:numId w:val="2"/>
-        </w:numPr>
-        <w:rPr>
-          <w:b/>
-          <w:bCs/>
-        </w:rPr>
-      </w:pPr>
-      <w:r>
-        <w:rPr>
-          <w:b/>
-          <w:bCs/>
-        </w:rPr>
-        <w:t xml:space="preserve">Esiste un </w:t>
-      </w:r>
-      <w:proofErr w:type="spellStart"/>
-      <w:r>
-        <w:rPr>
-          <w:b/>
-          <w:bCs/>
-        </w:rPr>
-        <w:t>accoun</w:t>
-      </w:r>
-      <w:proofErr w:type="spellEnd"/>
-      <w:r>
-        <w:rPr>
-          <w:b/>
-          <w:bCs/>
-        </w:rPr>
-        <w:t xml:space="preserve"> gmail di </w:t>
-      </w:r>
-      <w:proofErr w:type="spellStart"/>
-      <w:r>
-        <w:rPr>
-          <w:b/>
-          <w:bCs/>
-        </w:rPr>
-        <w:t>kaipai</w:t>
-      </w:r>
-      <w:proofErr w:type="spellEnd"/>
-      <w:r>
-        <w:rPr>
-          <w:b/>
-          <w:bCs/>
-        </w:rPr>
-        <w:t>?</w:t>
-      </w:r>
-    </w:p>
-    <w:p>
-      <w:pPr>
-        <w:pStyle w:val="Paragrafoelenco"/>
-        <w:numPr>
-          <w:ilvl w:val="0"/>
-          <w:numId w:val="2"/>
-        </w:numPr>
-        <w:rPr>
-          <w:b/>
-          <w:bCs/>
-        </w:rPr>
-      </w:pPr>
-      <w:r>
-        <w:rPr>
-          <w:b/>
-          <w:bCs/>
-        </w:rPr>
-        <w:t>Dominio? Lo creiamo e compriamo?</w:t>
+        <w:t>le tue sezioni è vuota dovrei poter creare una sessione e vedere la lista delle sessioni passate</w:t>
+      </w:r>
+    </w:p>
+    <w:p>
+      <w:pPr>
+        <w:rPr>
+          <w:b/>
+          <w:bCs/>
+        </w:rPr>
+      </w:pPr>
+      <w:r>
+        <w:rPr>
+          <w:b/>
+          <w:bCs/>
+        </w:rPr>
+        <w:t>ho creato una sessione da web ma non vedo in tempo reale la sessione nell'app e non ho ricevuto nessuna notifica</w:t>
       </w:r>
     </w:p>
     <w:p>

</xml_diff>